<commit_message>
Add academic title and classic baseline comparison
Updates the paper with a clearer academic framing, adds classic baseline experiments and the model architecture figure, and regenerates the DOCX for the revised manuscript.

Co-authored-by: Cursor <cursoragent@cursor.com>
</commit_message>
<xml_diff>
--- a/基于Transformer与运维事件感知的电站短期功率预测方法.docx
+++ b/基于Transformer与运维事件感知的电站短期功率预测方法.docx
@@ -14,7 +14,7 @@
           <w:b/>
           <w:sz w:val="32"/>
         </w:rPr>
-        <w:t>基于 Transformer 架构与多源运维事件感知的电站短期功率预测方法</w:t>
+        <w:t>融合场站异构性与运维事件感知的 Transformer 光伏电站短期功率预测方法</w:t>
       </w:r>
     </w:p>
     <w:p>
@@ -53,7 +53,7 @@
           <w:b w:val="0"/>
           <w:sz w:val="22"/>
         </w:rPr>
-        <w:t>摘要：针对新能源发电功率预测在电站运维系统部署中面临的空间异构、异常运维事件、限电与检修停机等问题，提出一种基于 Transformer 架构与运维事件感知的短期功率预测方法。首先，针对不同场站的容量规模和气象条件差异，采用场站专属建模策略，降低多场站混合训练可能引入的负迁移影响。其次，将计划检修、设备故障和电网限电等离散运维状态编码为可学习事件嵌入，并与历史出力、辐照度、温度及未来气象特征进行融合。最后，在预测头中引入 O&amp;M Gate 门控分支，根据未来可获得的计划检修指令施加输出抑制偏置，以减少检修时段预测残留。基于三座场站 1 h 分辨率样例数据的 GitHub Actions 复现实验表明，场站专属建模相较空间共享模型的 MAE 降幅为 20.83%~64.32%；在场站 C 上融入运维事件后，总体 MAE 由 1.096 MW 降至 0.566 MW，运维事件时段 MAE 由 2.439 MW 降至 1.482 MW；计划检修时段中，O&amp;M Gate 将 MAE 从无事件基线的 7.322 MW 降至 0.106 MW。本文的贡献主要体现在面向电站运维场景的建模流程整合、事件可获得性约束和实验协议透明化。</w:t>
+        <w:t>摘要：针对光伏电站短期功率预测在真实运维系统部署中面临的场站异构性、异常运维事件、限电与检修停机等问题，提出一种融合场站异构性与运维事件感知的 Transformer 预测方法。首先，针对不同场站的容量规模、气象条件和设备状态差异，采用场站专属建模策略，降低多场站混合训练可能引入的负迁移影响。其次，将计划检修、设备故障和电网限电等离散运维状态编码为可学习事件嵌入，并与历史出力、辐照度、温度及未来气象特征进行融合。最后，在预测头中引入 O&amp;M Gate 门控分支，根据未来可获得的计划检修指令施加输出抑制偏置，以减少检修时段预测残留。基于三座场站 1 h 分辨率样例数据的复现实验表明，场站专属建模相较空间共享模型的 MAE 降幅为 20.83%~64.32%；在场站 C 上，本文方法总体 MAE 为 0.528 MW，优于持久性预测、Ridge、SVR、随机森林、MLP、LSTM、GRU 和普通 Transformer 等经典基线；计划检修时段中，O&amp;M Gate 将 MAE 从无事件基线的 7.322 MW 降至 0.106 MW。本文的贡献主要体现在面向电站运维场景的建模流程整合、事件可获得性约束和实验协议透明化。</w:t>
       </w:r>
     </w:p>
     <w:p>
@@ -116,7 +116,7 @@
           <w:b w:val="0"/>
           <w:sz w:val="24"/>
         </w:rPr>
-        <w:t>Short-term power forecasting method for power stations based on Transformer and O&amp;M event awareness</w:t>
+        <w:t>Transformer-based short-term photovoltaic power forecasting with station heterogeneity and O&amp;M event awareness</w:t>
       </w:r>
     </w:p>
     <w:p>
@@ -529,6 +529,72 @@
           <w:sz w:val="28"/>
         </w:rPr>
         <w:t>3 运维感知 Transformer 功率预测模型设计</w:t>
+      </w:r>
+    </w:p>
+    <w:p>
+      <w:pPr>
+        <w:spacing w:line="300" w:lineRule="auto" w:after="120"/>
+      </w:pPr>
+      <w:r>
+        <w:rPr>
+          <w:rFonts w:ascii="宋体" w:hAnsi="宋体" w:eastAsia="宋体"/>
+          <w:b w:val="0"/>
+          <w:sz w:val="24"/>
+        </w:rPr>
+        <w:t>为对应前文提出的三类问题，本文模型整体采用“场站专属建模、事件嵌入融合、Transformer 时序建模与 O&amp;M Gate 输出抑制”的组合结构。图 1 展示了模型的整体流程：场站特性用于确定本地化建模边界；历史功率、辐照度和温度作为连续时序输入；计划检修、设备故障和限电等运维事件经嵌入层转换为连续向量；融合后的多源特征进入 Transformer 编解码器；最终通过 O&amp;M Gate 对计划检修等确定性事件下的输出进行抑制。</w:t>
+      </w:r>
+    </w:p>
+    <w:p>
+      <w:pPr>
+        <w:jc w:val="center"/>
+      </w:pPr>
+      <w:r>
+        <w:drawing>
+          <wp:inline xmlns:a="http://schemas.openxmlformats.org/drawingml/2006/main" xmlns:pic="http://schemas.openxmlformats.org/drawingml/2006/picture">
+            <wp:extent cx="5303520" cy="2853646"/>
+            <wp:docPr id="1" name="Picture 1"/>
+            <wp:cNvGraphicFramePr>
+              <a:graphicFrameLocks noChangeAspect="1"/>
+            </wp:cNvGraphicFramePr>
+            <a:graphic>
+              <a:graphicData uri="http://schemas.openxmlformats.org/drawingml/2006/picture">
+                <pic:pic>
+                  <pic:nvPicPr>
+                    <pic:cNvPr id="0" name="model_architecture.png"/>
+                    <pic:cNvPicPr/>
+                  </pic:nvPicPr>
+                  <pic:blipFill>
+                    <a:blip r:embed="rId9"/>
+                    <a:stretch>
+                      <a:fillRect/>
+                    </a:stretch>
+                  </pic:blipFill>
+                  <pic:spPr>
+                    <a:xfrm>
+                      <a:off x="0" y="0"/>
+                      <a:ext cx="5303520" cy="2853646"/>
+                    </a:xfrm>
+                    <a:prstGeom prst="rect"/>
+                  </pic:spPr>
+                </pic:pic>
+              </a:graphicData>
+            </a:graphic>
+          </wp:inline>
+        </w:drawing>
+      </w:r>
+    </w:p>
+    <w:p>
+      <w:pPr>
+        <w:spacing w:line="300" w:lineRule="auto" w:after="120"/>
+        <w:jc w:val="center"/>
+      </w:pPr>
+      <w:r>
+        <w:rPr>
+          <w:rFonts w:ascii="宋体" w:hAnsi="宋体" w:eastAsia="宋体"/>
+          <w:b/>
+          <w:sz w:val="20"/>
+        </w:rPr>
+        <w:t>图 1 融合场站异构性与运维事件感知的 Transformer 模型结构图</w:t>
       </w:r>
     </w:p>
     <w:p>
@@ -3804,7 +3870,7 @@
         <w:drawing>
           <wp:inline xmlns:a="http://schemas.openxmlformats.org/drawingml/2006/main" xmlns:pic="http://schemas.openxmlformats.org/drawingml/2006/picture">
             <wp:extent cx="5303520" cy="2961167"/>
-            <wp:docPr id="1" name="Picture 1"/>
+            <wp:docPr id="2" name="Picture 2"/>
             <wp:cNvGraphicFramePr>
               <a:graphicFrameLocks noChangeAspect="1"/>
             </wp:cNvGraphicFramePr>
@@ -3816,7 +3882,7 @@
                     <pic:cNvPicPr/>
                   </pic:nvPicPr>
                   <pic:blipFill>
-                    <a:blip r:embed="rId9"/>
+                    <a:blip r:embed="rId10"/>
                     <a:stretch>
                       <a:fillRect/>
                     </a:stretch>
@@ -4208,7 +4274,7 @@
         <w:drawing>
           <wp:inline xmlns:a="http://schemas.openxmlformats.org/drawingml/2006/main" xmlns:pic="http://schemas.openxmlformats.org/drawingml/2006/picture">
             <wp:extent cx="5303520" cy="2772295"/>
-            <wp:docPr id="2" name="Picture 2"/>
+            <wp:docPr id="3" name="Picture 3"/>
             <wp:cNvGraphicFramePr>
               <a:graphicFrameLocks noChangeAspect="1"/>
             </wp:cNvGraphicFramePr>
@@ -4220,7 +4286,7 @@
                     <pic:cNvPicPr/>
                   </pic:nvPicPr>
                   <pic:blipFill>
-                    <a:blip r:embed="rId10"/>
+                    <a:blip r:embed="rId11"/>
                     <a:stretch>
                       <a:fillRect/>
                     </a:stretch>
@@ -4595,7 +4661,7 @@
         <w:drawing>
           <wp:inline xmlns:a="http://schemas.openxmlformats.org/drawingml/2006/main" xmlns:pic="http://schemas.openxmlformats.org/drawingml/2006/picture">
             <wp:extent cx="5303520" cy="2860371"/>
-            <wp:docPr id="3" name="Picture 3"/>
+            <wp:docPr id="4" name="Picture 4"/>
             <wp:cNvGraphicFramePr>
               <a:graphicFrameLocks noChangeAspect="1"/>
             </wp:cNvGraphicFramePr>
@@ -4607,7 +4673,7 @@
                     <pic:cNvPicPr/>
                   </pic:nvPicPr>
                   <pic:blipFill>
-                    <a:blip r:embed="rId11"/>
+                    <a:blip r:embed="rId12"/>
                     <a:stretch>
                       <a:fillRect/>
                     </a:stretch>
@@ -4651,7 +4717,7 @@
           <w:b/>
           <w:sz w:val="22"/>
         </w:rPr>
-        <w:t>4.2.4 Embedding 消融实验：One-Hot vs. Learnable Embedding</w:t>
+        <w:t>4.2.4 经典算法对比实验</w:t>
       </w:r>
     </w:p>
     <w:p>
@@ -4664,7 +4730,868 @@
           <w:b w:val="0"/>
           <w:sz w:val="24"/>
         </w:rPr>
-        <w:t>为验证事件嵌入（Embedding）机制的效果，对比了 One-Hot 编码、静态 Embedding 与 Learnable Embedding。One-Hot 模型 MAE 为 0.823 MW，Learnable Embedding 模型为 0.618 MW。图 5 给出事件嵌入可视化示例，用于辅助观察不同事件表示的分离趋势；该图不作为单独的理论证明，结论仍以误差指标和消融实验为主。</w:t>
+        <w:t>为回应“现有模型多基于传统算法或常规深度学习模型，模型本身存在适配局限”的问题，本文在场站 C 上补充经典算法对比实验。对比对象覆盖持久性预测、Ridge 回归、SVR、随机森林、MLP、LSTM、GRU、普通 Transformer 以及本文 O&amp;M Aware Transformer。所有模型采用相同时间切分、相同 24 h 历史窗口与 24 h 预测步长，机器学习模型以历史气象/功率和未来气象展平向量作为输入，循环网络和 Transformer 使用相同归一化数据协议。</w:t>
+      </w:r>
+    </w:p>
+    <w:p>
+      <w:pPr>
+        <w:spacing w:line="300" w:lineRule="auto" w:after="120"/>
+        <w:jc w:val="center"/>
+      </w:pPr>
+      <w:r>
+        <w:rPr>
+          <w:rFonts w:ascii="宋体" w:hAnsi="宋体" w:eastAsia="宋体"/>
+          <w:b/>
+          <w:sz w:val="20"/>
+        </w:rPr>
+        <w:t>表 7 经典算法与本文方法对比实验（场站 C）</w:t>
+      </w:r>
+    </w:p>
+    <w:tbl>
+      <w:tblPr>
+        <w:tblStyle w:val="TableGrid"/>
+        <w:tblW w:type="auto" w:w="0"/>
+        <w:tblLook w:firstColumn="1" w:firstRow="1" w:lastColumn="0" w:lastRow="0" w:noHBand="0" w:noVBand="1" w:val="04A0"/>
+      </w:tblPr>
+      <w:tblGrid>
+        <w:gridCol w:w="2412"/>
+        <w:gridCol w:w="2412"/>
+        <w:gridCol w:w="2412"/>
+        <w:gridCol w:w="2412"/>
+      </w:tblGrid>
+      <w:tr>
+        <w:tc>
+          <w:tcPr>
+            <w:tcW w:type="dxa" w:w="2412"/>
+          </w:tcPr>
+          <w:p>
+            <w:pPr>
+              <w:jc w:val="center"/>
+            </w:pPr>
+            <w:r>
+              <w:rPr>
+                <w:rFonts w:ascii="宋体" w:hAnsi="宋体" w:eastAsia="宋体"/>
+                <w:b/>
+                <w:sz w:val="18"/>
+              </w:rPr>
+              <w:t>模型</w:t>
+            </w:r>
+          </w:p>
+        </w:tc>
+        <w:tc>
+          <w:tcPr>
+            <w:tcW w:type="dxa" w:w="2412"/>
+          </w:tcPr>
+          <w:p>
+            <w:pPr>
+              <w:jc w:val="center"/>
+            </w:pPr>
+            <w:r>
+              <w:rPr>
+                <w:rFonts w:ascii="宋体" w:hAnsi="宋体" w:eastAsia="宋体"/>
+                <w:b/>
+                <w:sz w:val="18"/>
+              </w:rPr>
+              <w:t>总体 MAE (MW)</w:t>
+            </w:r>
+          </w:p>
+        </w:tc>
+        <w:tc>
+          <w:tcPr>
+            <w:tcW w:type="dxa" w:w="2412"/>
+          </w:tcPr>
+          <w:p>
+            <w:pPr>
+              <w:jc w:val="center"/>
+            </w:pPr>
+            <w:r>
+              <w:rPr>
+                <w:rFonts w:ascii="宋体" w:hAnsi="宋体" w:eastAsia="宋体"/>
+                <w:b/>
+                <w:sz w:val="18"/>
+              </w:rPr>
+              <w:t>总体 RMSE (MW)</w:t>
+            </w:r>
+          </w:p>
+        </w:tc>
+        <w:tc>
+          <w:tcPr>
+            <w:tcW w:type="dxa" w:w="2412"/>
+          </w:tcPr>
+          <w:p>
+            <w:pPr>
+              <w:jc w:val="center"/>
+            </w:pPr>
+            <w:r>
+              <w:rPr>
+                <w:rFonts w:ascii="宋体" w:hAnsi="宋体" w:eastAsia="宋体"/>
+                <w:b/>
+                <w:sz w:val="18"/>
+              </w:rPr>
+              <w:t>事件时段 MAE (MW)</w:t>
+            </w:r>
+          </w:p>
+        </w:tc>
+      </w:tr>
+      <w:tr>
+        <w:tc>
+          <w:tcPr>
+            <w:tcW w:type="dxa" w:w="2412"/>
+          </w:tcPr>
+          <w:p>
+            <w:pPr>
+              <w:jc w:val="center"/>
+            </w:pPr>
+            <w:r>
+              <w:rPr>
+                <w:rFonts w:ascii="宋体" w:hAnsi="宋体" w:eastAsia="宋体"/>
+                <w:b w:val="0"/>
+                <w:sz w:val="18"/>
+              </w:rPr>
+              <w:t>O&amp;M Aware Transformer</w:t>
+            </w:r>
+          </w:p>
+        </w:tc>
+        <w:tc>
+          <w:tcPr>
+            <w:tcW w:type="dxa" w:w="2412"/>
+          </w:tcPr>
+          <w:p>
+            <w:pPr>
+              <w:jc w:val="center"/>
+            </w:pPr>
+            <w:r>
+              <w:rPr>
+                <w:rFonts w:ascii="宋体" w:hAnsi="宋体" w:eastAsia="宋体"/>
+                <w:b w:val="0"/>
+                <w:sz w:val="18"/>
+              </w:rPr>
+              <w:t>0.528</w:t>
+            </w:r>
+          </w:p>
+        </w:tc>
+        <w:tc>
+          <w:tcPr>
+            <w:tcW w:type="dxa" w:w="2412"/>
+          </w:tcPr>
+          <w:p>
+            <w:pPr>
+              <w:jc w:val="center"/>
+            </w:pPr>
+            <w:r>
+              <w:rPr>
+                <w:rFonts w:ascii="宋体" w:hAnsi="宋体" w:eastAsia="宋体"/>
+                <w:b w:val="0"/>
+                <w:sz w:val="18"/>
+              </w:rPr>
+              <w:t>1.437</w:t>
+            </w:r>
+          </w:p>
+        </w:tc>
+        <w:tc>
+          <w:tcPr>
+            <w:tcW w:type="dxa" w:w="2412"/>
+          </w:tcPr>
+          <w:p>
+            <w:pPr>
+              <w:jc w:val="center"/>
+            </w:pPr>
+            <w:r>
+              <w:rPr>
+                <w:rFonts w:ascii="宋体" w:hAnsi="宋体" w:eastAsia="宋体"/>
+                <w:b w:val="0"/>
+                <w:sz w:val="18"/>
+              </w:rPr>
+              <w:t>1.558</w:t>
+            </w:r>
+          </w:p>
+        </w:tc>
+      </w:tr>
+      <w:tr>
+        <w:tc>
+          <w:tcPr>
+            <w:tcW w:type="dxa" w:w="2412"/>
+          </w:tcPr>
+          <w:p>
+            <w:pPr>
+              <w:jc w:val="center"/>
+            </w:pPr>
+            <w:r>
+              <w:rPr>
+                <w:rFonts w:ascii="宋体" w:hAnsi="宋体" w:eastAsia="宋体"/>
+                <w:b w:val="0"/>
+                <w:sz w:val="18"/>
+              </w:rPr>
+              <w:t>Ridge</w:t>
+            </w:r>
+          </w:p>
+        </w:tc>
+        <w:tc>
+          <w:tcPr>
+            <w:tcW w:type="dxa" w:w="2412"/>
+          </w:tcPr>
+          <w:p>
+            <w:pPr>
+              <w:jc w:val="center"/>
+            </w:pPr>
+            <w:r>
+              <w:rPr>
+                <w:rFonts w:ascii="宋体" w:hAnsi="宋体" w:eastAsia="宋体"/>
+                <w:b w:val="0"/>
+                <w:sz w:val="18"/>
+              </w:rPr>
+              <w:t>1.017</w:t>
+            </w:r>
+          </w:p>
+        </w:tc>
+        <w:tc>
+          <w:tcPr>
+            <w:tcW w:type="dxa" w:w="2412"/>
+          </w:tcPr>
+          <w:p>
+            <w:pPr>
+              <w:jc w:val="center"/>
+            </w:pPr>
+            <w:r>
+              <w:rPr>
+                <w:rFonts w:ascii="宋体" w:hAnsi="宋体" w:eastAsia="宋体"/>
+                <w:b w:val="0"/>
+                <w:sz w:val="18"/>
+              </w:rPr>
+              <w:t>2.205</w:t>
+            </w:r>
+          </w:p>
+        </w:tc>
+        <w:tc>
+          <w:tcPr>
+            <w:tcW w:type="dxa" w:w="2412"/>
+          </w:tcPr>
+          <w:p>
+            <w:pPr>
+              <w:jc w:val="center"/>
+            </w:pPr>
+            <w:r>
+              <w:rPr>
+                <w:rFonts w:ascii="宋体" w:hAnsi="宋体" w:eastAsia="宋体"/>
+                <w:b w:val="0"/>
+                <w:sz w:val="18"/>
+              </w:rPr>
+              <w:t>2.821</w:t>
+            </w:r>
+          </w:p>
+        </w:tc>
+      </w:tr>
+      <w:tr>
+        <w:tc>
+          <w:tcPr>
+            <w:tcW w:type="dxa" w:w="2412"/>
+          </w:tcPr>
+          <w:p>
+            <w:pPr>
+              <w:jc w:val="center"/>
+            </w:pPr>
+            <w:r>
+              <w:rPr>
+                <w:rFonts w:ascii="宋体" w:hAnsi="宋体" w:eastAsia="宋体"/>
+                <w:b w:val="0"/>
+                <w:sz w:val="18"/>
+              </w:rPr>
+              <w:t>Transformer</w:t>
+            </w:r>
+          </w:p>
+        </w:tc>
+        <w:tc>
+          <w:tcPr>
+            <w:tcW w:type="dxa" w:w="2412"/>
+          </w:tcPr>
+          <w:p>
+            <w:pPr>
+              <w:jc w:val="center"/>
+            </w:pPr>
+            <w:r>
+              <w:rPr>
+                <w:rFonts w:ascii="宋体" w:hAnsi="宋体" w:eastAsia="宋体"/>
+                <w:b w:val="0"/>
+                <w:sz w:val="18"/>
+              </w:rPr>
+              <w:t>1.193</w:t>
+            </w:r>
+          </w:p>
+        </w:tc>
+        <w:tc>
+          <w:tcPr>
+            <w:tcW w:type="dxa" w:w="2412"/>
+          </w:tcPr>
+          <w:p>
+            <w:pPr>
+              <w:jc w:val="center"/>
+            </w:pPr>
+            <w:r>
+              <w:rPr>
+                <w:rFonts w:ascii="宋体" w:hAnsi="宋体" w:eastAsia="宋体"/>
+                <w:b w:val="0"/>
+                <w:sz w:val="18"/>
+              </w:rPr>
+              <w:t>2.490</w:t>
+            </w:r>
+          </w:p>
+        </w:tc>
+        <w:tc>
+          <w:tcPr>
+            <w:tcW w:type="dxa" w:w="2412"/>
+          </w:tcPr>
+          <w:p>
+            <w:pPr>
+              <w:jc w:val="center"/>
+            </w:pPr>
+            <w:r>
+              <w:rPr>
+                <w:rFonts w:ascii="宋体" w:hAnsi="宋体" w:eastAsia="宋体"/>
+                <w:b w:val="0"/>
+                <w:sz w:val="18"/>
+              </w:rPr>
+              <w:t>2.617</w:t>
+            </w:r>
+          </w:p>
+        </w:tc>
+      </w:tr>
+      <w:tr>
+        <w:tc>
+          <w:tcPr>
+            <w:tcW w:type="dxa" w:w="2412"/>
+          </w:tcPr>
+          <w:p>
+            <w:pPr>
+              <w:jc w:val="center"/>
+            </w:pPr>
+            <w:r>
+              <w:rPr>
+                <w:rFonts w:ascii="宋体" w:hAnsi="宋体" w:eastAsia="宋体"/>
+                <w:b w:val="0"/>
+                <w:sz w:val="18"/>
+              </w:rPr>
+              <w:t>SVR</w:t>
+            </w:r>
+          </w:p>
+        </w:tc>
+        <w:tc>
+          <w:tcPr>
+            <w:tcW w:type="dxa" w:w="2412"/>
+          </w:tcPr>
+          <w:p>
+            <w:pPr>
+              <w:jc w:val="center"/>
+            </w:pPr>
+            <w:r>
+              <w:rPr>
+                <w:rFonts w:ascii="宋体" w:hAnsi="宋体" w:eastAsia="宋体"/>
+                <w:b w:val="0"/>
+                <w:sz w:val="18"/>
+              </w:rPr>
+              <w:t>1.224</w:t>
+            </w:r>
+          </w:p>
+        </w:tc>
+        <w:tc>
+          <w:tcPr>
+            <w:tcW w:type="dxa" w:w="2412"/>
+          </w:tcPr>
+          <w:p>
+            <w:pPr>
+              <w:jc w:val="center"/>
+            </w:pPr>
+            <w:r>
+              <w:rPr>
+                <w:rFonts w:ascii="宋体" w:hAnsi="宋体" w:eastAsia="宋体"/>
+                <w:b w:val="0"/>
+                <w:sz w:val="18"/>
+              </w:rPr>
+              <w:t>2.379</w:t>
+            </w:r>
+          </w:p>
+        </w:tc>
+        <w:tc>
+          <w:tcPr>
+            <w:tcW w:type="dxa" w:w="2412"/>
+          </w:tcPr>
+          <w:p>
+            <w:pPr>
+              <w:jc w:val="center"/>
+            </w:pPr>
+            <w:r>
+              <w:rPr>
+                <w:rFonts w:ascii="宋体" w:hAnsi="宋体" w:eastAsia="宋体"/>
+                <w:b w:val="0"/>
+                <w:sz w:val="18"/>
+              </w:rPr>
+              <w:t>3.107</w:t>
+            </w:r>
+          </w:p>
+        </w:tc>
+      </w:tr>
+      <w:tr>
+        <w:tc>
+          <w:tcPr>
+            <w:tcW w:type="dxa" w:w="2412"/>
+          </w:tcPr>
+          <w:p>
+            <w:pPr>
+              <w:jc w:val="center"/>
+            </w:pPr>
+            <w:r>
+              <w:rPr>
+                <w:rFonts w:ascii="宋体" w:hAnsi="宋体" w:eastAsia="宋体"/>
+                <w:b w:val="0"/>
+                <w:sz w:val="18"/>
+              </w:rPr>
+              <w:t>MLP</w:t>
+            </w:r>
+          </w:p>
+        </w:tc>
+        <w:tc>
+          <w:tcPr>
+            <w:tcW w:type="dxa" w:w="2412"/>
+          </w:tcPr>
+          <w:p>
+            <w:pPr>
+              <w:jc w:val="center"/>
+            </w:pPr>
+            <w:r>
+              <w:rPr>
+                <w:rFonts w:ascii="宋体" w:hAnsi="宋体" w:eastAsia="宋体"/>
+                <w:b w:val="0"/>
+                <w:sz w:val="18"/>
+              </w:rPr>
+              <w:t>1.321</w:t>
+            </w:r>
+          </w:p>
+        </w:tc>
+        <w:tc>
+          <w:tcPr>
+            <w:tcW w:type="dxa" w:w="2412"/>
+          </w:tcPr>
+          <w:p>
+            <w:pPr>
+              <w:jc w:val="center"/>
+            </w:pPr>
+            <w:r>
+              <w:rPr>
+                <w:rFonts w:ascii="宋体" w:hAnsi="宋体" w:eastAsia="宋体"/>
+                <w:b w:val="0"/>
+                <w:sz w:val="18"/>
+              </w:rPr>
+              <w:t>2.442</w:t>
+            </w:r>
+          </w:p>
+        </w:tc>
+        <w:tc>
+          <w:tcPr>
+            <w:tcW w:type="dxa" w:w="2412"/>
+          </w:tcPr>
+          <w:p>
+            <w:pPr>
+              <w:jc w:val="center"/>
+            </w:pPr>
+            <w:r>
+              <w:rPr>
+                <w:rFonts w:ascii="宋体" w:hAnsi="宋体" w:eastAsia="宋体"/>
+                <w:b w:val="0"/>
+                <w:sz w:val="18"/>
+              </w:rPr>
+              <w:t>2.978</w:t>
+            </w:r>
+          </w:p>
+        </w:tc>
+      </w:tr>
+      <w:tr>
+        <w:tc>
+          <w:tcPr>
+            <w:tcW w:type="dxa" w:w="2412"/>
+          </w:tcPr>
+          <w:p>
+            <w:pPr>
+              <w:jc w:val="center"/>
+            </w:pPr>
+            <w:r>
+              <w:rPr>
+                <w:rFonts w:ascii="宋体" w:hAnsi="宋体" w:eastAsia="宋体"/>
+                <w:b w:val="0"/>
+                <w:sz w:val="18"/>
+              </w:rPr>
+              <w:t>LSTM</w:t>
+            </w:r>
+          </w:p>
+        </w:tc>
+        <w:tc>
+          <w:tcPr>
+            <w:tcW w:type="dxa" w:w="2412"/>
+          </w:tcPr>
+          <w:p>
+            <w:pPr>
+              <w:jc w:val="center"/>
+            </w:pPr>
+            <w:r>
+              <w:rPr>
+                <w:rFonts w:ascii="宋体" w:hAnsi="宋体" w:eastAsia="宋体"/>
+                <w:b w:val="0"/>
+                <w:sz w:val="18"/>
+              </w:rPr>
+              <w:t>1.453</w:t>
+            </w:r>
+          </w:p>
+        </w:tc>
+        <w:tc>
+          <w:tcPr>
+            <w:tcW w:type="dxa" w:w="2412"/>
+          </w:tcPr>
+          <w:p>
+            <w:pPr>
+              <w:jc w:val="center"/>
+            </w:pPr>
+            <w:r>
+              <w:rPr>
+                <w:rFonts w:ascii="宋体" w:hAnsi="宋体" w:eastAsia="宋体"/>
+                <w:b w:val="0"/>
+                <w:sz w:val="18"/>
+              </w:rPr>
+              <w:t>2.546</w:t>
+            </w:r>
+          </w:p>
+        </w:tc>
+        <w:tc>
+          <w:tcPr>
+            <w:tcW w:type="dxa" w:w="2412"/>
+          </w:tcPr>
+          <w:p>
+            <w:pPr>
+              <w:jc w:val="center"/>
+            </w:pPr>
+            <w:r>
+              <w:rPr>
+                <w:rFonts w:ascii="宋体" w:hAnsi="宋体" w:eastAsia="宋体"/>
+                <w:b w:val="0"/>
+                <w:sz w:val="18"/>
+              </w:rPr>
+              <w:t>3.144</w:t>
+            </w:r>
+          </w:p>
+        </w:tc>
+      </w:tr>
+      <w:tr>
+        <w:tc>
+          <w:tcPr>
+            <w:tcW w:type="dxa" w:w="2412"/>
+          </w:tcPr>
+          <w:p>
+            <w:pPr>
+              <w:jc w:val="center"/>
+            </w:pPr>
+            <w:r>
+              <w:rPr>
+                <w:rFonts w:ascii="宋体" w:hAnsi="宋体" w:eastAsia="宋体"/>
+                <w:b w:val="0"/>
+                <w:sz w:val="18"/>
+              </w:rPr>
+              <w:t>Random Forest</w:t>
+            </w:r>
+          </w:p>
+        </w:tc>
+        <w:tc>
+          <w:tcPr>
+            <w:tcW w:type="dxa" w:w="2412"/>
+          </w:tcPr>
+          <w:p>
+            <w:pPr>
+              <w:jc w:val="center"/>
+            </w:pPr>
+            <w:r>
+              <w:rPr>
+                <w:rFonts w:ascii="宋体" w:hAnsi="宋体" w:eastAsia="宋体"/>
+                <w:b w:val="0"/>
+                <w:sz w:val="18"/>
+              </w:rPr>
+              <w:t>1.453</w:t>
+            </w:r>
+          </w:p>
+        </w:tc>
+        <w:tc>
+          <w:tcPr>
+            <w:tcW w:type="dxa" w:w="2412"/>
+          </w:tcPr>
+          <w:p>
+            <w:pPr>
+              <w:jc w:val="center"/>
+            </w:pPr>
+            <w:r>
+              <w:rPr>
+                <w:rFonts w:ascii="宋体" w:hAnsi="宋体" w:eastAsia="宋体"/>
+                <w:b w:val="0"/>
+                <w:sz w:val="18"/>
+              </w:rPr>
+              <w:t>2.650</w:t>
+            </w:r>
+          </w:p>
+        </w:tc>
+        <w:tc>
+          <w:tcPr>
+            <w:tcW w:type="dxa" w:w="2412"/>
+          </w:tcPr>
+          <w:p>
+            <w:pPr>
+              <w:jc w:val="center"/>
+            </w:pPr>
+            <w:r>
+              <w:rPr>
+                <w:rFonts w:ascii="宋体" w:hAnsi="宋体" w:eastAsia="宋体"/>
+                <w:b w:val="0"/>
+                <w:sz w:val="18"/>
+              </w:rPr>
+              <w:t>2.612</w:t>
+            </w:r>
+          </w:p>
+        </w:tc>
+      </w:tr>
+      <w:tr>
+        <w:tc>
+          <w:tcPr>
+            <w:tcW w:type="dxa" w:w="2412"/>
+          </w:tcPr>
+          <w:p>
+            <w:pPr>
+              <w:jc w:val="center"/>
+            </w:pPr>
+            <w:r>
+              <w:rPr>
+                <w:rFonts w:ascii="宋体" w:hAnsi="宋体" w:eastAsia="宋体"/>
+                <w:b w:val="0"/>
+                <w:sz w:val="18"/>
+              </w:rPr>
+              <w:t>GRU</w:t>
+            </w:r>
+          </w:p>
+        </w:tc>
+        <w:tc>
+          <w:tcPr>
+            <w:tcW w:type="dxa" w:w="2412"/>
+          </w:tcPr>
+          <w:p>
+            <w:pPr>
+              <w:jc w:val="center"/>
+            </w:pPr>
+            <w:r>
+              <w:rPr>
+                <w:rFonts w:ascii="宋体" w:hAnsi="宋体" w:eastAsia="宋体"/>
+                <w:b w:val="0"/>
+                <w:sz w:val="18"/>
+              </w:rPr>
+              <w:t>1.536</w:t>
+            </w:r>
+          </w:p>
+        </w:tc>
+        <w:tc>
+          <w:tcPr>
+            <w:tcW w:type="dxa" w:w="2412"/>
+          </w:tcPr>
+          <w:p>
+            <w:pPr>
+              <w:jc w:val="center"/>
+            </w:pPr>
+            <w:r>
+              <w:rPr>
+                <w:rFonts w:ascii="宋体" w:hAnsi="宋体" w:eastAsia="宋体"/>
+                <w:b w:val="0"/>
+                <w:sz w:val="18"/>
+              </w:rPr>
+              <w:t>2.564</w:t>
+            </w:r>
+          </w:p>
+        </w:tc>
+        <w:tc>
+          <w:tcPr>
+            <w:tcW w:type="dxa" w:w="2412"/>
+          </w:tcPr>
+          <w:p>
+            <w:pPr>
+              <w:jc w:val="center"/>
+            </w:pPr>
+            <w:r>
+              <w:rPr>
+                <w:rFonts w:ascii="宋体" w:hAnsi="宋体" w:eastAsia="宋体"/>
+                <w:b w:val="0"/>
+                <w:sz w:val="18"/>
+              </w:rPr>
+              <w:t>2.495</w:t>
+            </w:r>
+          </w:p>
+        </w:tc>
+      </w:tr>
+      <w:tr>
+        <w:tc>
+          <w:tcPr>
+            <w:tcW w:type="dxa" w:w="2412"/>
+          </w:tcPr>
+          <w:p>
+            <w:pPr>
+              <w:jc w:val="center"/>
+            </w:pPr>
+            <w:r>
+              <w:rPr>
+                <w:rFonts w:ascii="宋体" w:hAnsi="宋体" w:eastAsia="宋体"/>
+                <w:b w:val="0"/>
+                <w:sz w:val="18"/>
+              </w:rPr>
+              <w:t>Persistence</w:t>
+            </w:r>
+          </w:p>
+        </w:tc>
+        <w:tc>
+          <w:tcPr>
+            <w:tcW w:type="dxa" w:w="2412"/>
+          </w:tcPr>
+          <w:p>
+            <w:pPr>
+              <w:jc w:val="center"/>
+            </w:pPr>
+            <w:r>
+              <w:rPr>
+                <w:rFonts w:ascii="宋体" w:hAnsi="宋体" w:eastAsia="宋体"/>
+                <w:b w:val="0"/>
+                <w:sz w:val="18"/>
+              </w:rPr>
+              <w:t>5.309</w:t>
+            </w:r>
+          </w:p>
+        </w:tc>
+        <w:tc>
+          <w:tcPr>
+            <w:tcW w:type="dxa" w:w="2412"/>
+          </w:tcPr>
+          <w:p>
+            <w:pPr>
+              <w:jc w:val="center"/>
+            </w:pPr>
+            <w:r>
+              <w:rPr>
+                <w:rFonts w:ascii="宋体" w:hAnsi="宋体" w:eastAsia="宋体"/>
+                <w:b w:val="0"/>
+                <w:sz w:val="18"/>
+              </w:rPr>
+              <w:t>7.669</w:t>
+            </w:r>
+          </w:p>
+        </w:tc>
+        <w:tc>
+          <w:tcPr>
+            <w:tcW w:type="dxa" w:w="2412"/>
+          </w:tcPr>
+          <w:p>
+            <w:pPr>
+              <w:jc w:val="center"/>
+            </w:pPr>
+            <w:r>
+              <w:rPr>
+                <w:rFonts w:ascii="宋体" w:hAnsi="宋体" w:eastAsia="宋体"/>
+                <w:b w:val="0"/>
+                <w:sz w:val="18"/>
+              </w:rPr>
+              <w:t>3.754</w:t>
+            </w:r>
+          </w:p>
+        </w:tc>
+      </w:tr>
+    </w:tbl>
+    <w:p/>
+    <w:p>
+      <w:pPr>
+        <w:spacing w:line="300" w:lineRule="auto" w:after="120"/>
+      </w:pPr>
+      <w:r>
+        <w:rPr>
+          <w:rFonts w:ascii="宋体" w:hAnsi="宋体" w:eastAsia="宋体"/>
+          <w:b w:val="0"/>
+          <w:sz w:val="24"/>
+        </w:rPr>
+        <w:t>表 7 显示，本文方法在总体 MAE 和事件时段 MAE 上均优于多数经典基线，说明单纯依赖统计回归、核方法、树模型或循环网络难以同时处理长时依赖和运维事件状态切换。普通 Transformer 的总体 MAE 为 1.193 MW，仍高于本文方法，表明模型收益并非仅来自 Transformer 结构，而与运维事件嵌入和门控输出抑制有关。</w:t>
+      </w:r>
+    </w:p>
+    <w:p>
+      <w:pPr>
+        <w:jc w:val="center"/>
+      </w:pPr>
+      <w:r>
+        <w:drawing>
+          <wp:inline xmlns:a="http://schemas.openxmlformats.org/drawingml/2006/main" xmlns:pic="http://schemas.openxmlformats.org/drawingml/2006/picture">
+            <wp:extent cx="5303520" cy="2828544"/>
+            <wp:docPr id="5" name="Picture 5"/>
+            <wp:cNvGraphicFramePr>
+              <a:graphicFrameLocks noChangeAspect="1"/>
+            </wp:cNvGraphicFramePr>
+            <a:graphic>
+              <a:graphicData uri="http://schemas.openxmlformats.org/drawingml/2006/picture">
+                <pic:pic>
+                  <pic:nvPicPr>
+                    <pic:cNvPr id="0" name="baseline_comparison.png"/>
+                    <pic:cNvPicPr/>
+                  </pic:nvPicPr>
+                  <pic:blipFill>
+                    <a:blip r:embed="rId13"/>
+                    <a:stretch>
+                      <a:fillRect/>
+                    </a:stretch>
+                  </pic:blipFill>
+                  <pic:spPr>
+                    <a:xfrm>
+                      <a:off x="0" y="0"/>
+                      <a:ext cx="5303520" cy="2828544"/>
+                    </a:xfrm>
+                    <a:prstGeom prst="rect"/>
+                  </pic:spPr>
+                </pic:pic>
+              </a:graphicData>
+            </a:graphic>
+          </wp:inline>
+        </w:drawing>
+      </w:r>
+    </w:p>
+    <w:p>
+      <w:pPr>
+        <w:spacing w:line="300" w:lineRule="auto" w:after="120"/>
+        <w:jc w:val="center"/>
+      </w:pPr>
+      <w:r>
+        <w:rPr>
+          <w:rFonts w:ascii="宋体" w:hAnsi="宋体" w:eastAsia="宋体"/>
+          <w:b/>
+          <w:sz w:val="20"/>
+        </w:rPr>
+        <w:t>图 5 经典算法与本文模型误差对比</w:t>
+      </w:r>
+    </w:p>
+    <w:p>
+      <w:pPr>
+        <w:pStyle w:val="Heading3"/>
+        <w:spacing w:line="300" w:lineRule="auto" w:after="120"/>
+      </w:pPr>
+      <w:r>
+        <w:rPr>
+          <w:rFonts w:ascii="宋体" w:hAnsi="宋体" w:eastAsia="宋体"/>
+          <w:b/>
+          <w:sz w:val="22"/>
+        </w:rPr>
+        <w:t>4.2.5 Embedding 消融实验：One-Hot vs. Learnable Embedding</w:t>
+      </w:r>
+    </w:p>
+    <w:p>
+      <w:pPr>
+        <w:spacing w:line="300" w:lineRule="auto" w:after="120"/>
+      </w:pPr>
+      <w:r>
+        <w:rPr>
+          <w:rFonts w:ascii="宋体" w:hAnsi="宋体" w:eastAsia="宋体"/>
+          <w:b w:val="0"/>
+          <w:sz w:val="24"/>
+        </w:rPr>
+        <w:t>为验证事件嵌入（Embedding）机制的效果，对比了 One-Hot 编码、静态 Embedding 与 Learnable Embedding。One-Hot 模型 MAE 为 0.823 MW，Learnable Embedding 模型为 0.618 MW。图 6 给出事件嵌入可视化示例，用于辅助观察不同事件表示的分离趋势；该图不作为单独的理论证明，结论仍以误差指标和消融实验为主。</w:t>
       </w:r>
     </w:p>
     <w:p>
@@ -4675,7 +5602,7 @@
         <w:drawing>
           <wp:inline xmlns:a="http://schemas.openxmlformats.org/drawingml/2006/main" xmlns:pic="http://schemas.openxmlformats.org/drawingml/2006/picture">
             <wp:extent cx="5303520" cy="3977640"/>
-            <wp:docPr id="4" name="Picture 4"/>
+            <wp:docPr id="6" name="Picture 6"/>
             <wp:cNvGraphicFramePr>
               <a:graphicFrameLocks noChangeAspect="1"/>
             </wp:cNvGraphicFramePr>
@@ -4687,7 +5614,7 @@
                     <pic:cNvPicPr/>
                   </pic:nvPicPr>
                   <pic:blipFill>
-                    <a:blip r:embed="rId12"/>
+                    <a:blip r:embed="rId14"/>
                     <a:stretch>
                       <a:fillRect/>
                     </a:stretch>
@@ -4717,7 +5644,7 @@
           <w:b/>
           <w:sz w:val="20"/>
         </w:rPr>
-        <w:t>图 5 运维状态 Embedding 的 t-SNE 可视化聚类图</w:t>
+        <w:t>图 6 运维状态 Embedding 的 t-SNE 可视化聚类图</w:t>
       </w:r>
     </w:p>
     <w:p>
@@ -4731,7 +5658,7 @@
           <w:b/>
           <w:sz w:val="22"/>
         </w:rPr>
-        <w:t>4.2.5 门控先验偏置敏感性分析</w:t>
+        <w:t>4.2.6 门控先验偏置敏感性分析</w:t>
       </w:r>
     </w:p>
     <w:p>
@@ -4744,7 +5671,7 @@
           <w:b w:val="0"/>
           <w:sz w:val="24"/>
         </w:rPr>
-        <w:t>为评估 O&amp;M Gate 中检修事件先验偏置 $\beta_1$ 的影响，在场站 C 上设置 $\beta_1 \in \{0,1,5,10,15\}$ 进行对比。表 7 显示，偏置为 0 时计划检修期 MAE 为 0.1280 MW；当偏置增加到 5、10、15 时，MAE 分别为 0.1067 MW、0.1116 MW 和 0.1072 MW，整体处于高抑制区间。该结果说明门控偏置不需要无限增大，过大的饱和偏置并未带来稳定优势，选择 $\beta_1=10$ 是在抑制残留和保留梯度通路之间的折中设置。</w:t>
+        <w:t>为评估 O&amp;M Gate 中检修事件先验偏置 $\beta_1$ 的影响，在场站 C 上设置 $\beta_1 \in \{0,1,5,10,15\}$ 进行对比。表 8 显示，偏置为 0 时计划检修期 MAE 为 0.1280 MW；当偏置增加到 5、10、15 时，MAE 分别为 0.1067 MW、0.1116 MW 和 0.1072 MW，整体处于高抑制区间。该结果说明门控偏置不需要无限增大，过大的饱和偏置并未带来稳定优势，选择 $\beta_1=10$ 是在抑制残留和保留梯度通路之间的折中设置。</w:t>
       </w:r>
     </w:p>
     <w:p>
@@ -4758,7 +5685,7 @@
           <w:b/>
           <w:sz w:val="20"/>
         </w:rPr>
-        <w:t>表 7 门控先验偏置敏感性实验</w:t>
+        <w:t>表 8 门控先验偏置敏感性实验</w:t>
       </w:r>
     </w:p>
     <w:tbl>
@@ -5121,7 +6048,7 @@
           <w:b/>
           <w:sz w:val="22"/>
         </w:rPr>
-        <w:t>4.2.6 不同预测跨度敏感性分析</w:t>
+        <w:t>4.2.7 不同预测跨度敏感性分析</w:t>
       </w:r>
     </w:p>
     <w:p>
@@ -5134,7 +6061,7 @@
           <w:b w:val="0"/>
           <w:sz w:val="24"/>
         </w:rPr>
-        <w:t>实验五比较了 $H=12,24,48,72$ h 四种预测跨度下的场站 C 测试集表现。表 8 显示，在本样例数据中，24 h、48 h 和 72 h 的 MAE 均处于 0.578~0.626 MW 区间，12 h 的 MAE 为 0.880 MW。该结果没有呈现单调随预测跨度增大而恶化的趋势，可能与不同窗口下训练样本构成、检修片段覆盖比例和随机初始化有关。因此，本文仅将其作为预测跨度敏感性结果报告，不据此推出模型在长预测跨度上必然更优的结论。</w:t>
+        <w:t>实验五比较了 $H=12,24,48,72$ h 四种预测跨度下的场站 C 测试集表现。表 9 显示，在本样例数据中，24 h、48 h 和 72 h 的 MAE 均处于 0.578~0.626 MW 区间，12 h 的 MAE 为 0.880 MW。该结果没有呈现单调随预测跨度增大而恶化的趋势，可能与不同窗口下训练样本构成、检修片段覆盖比例和随机初始化有关。因此，本文仅将其作为预测跨度敏感性结果报告，不据此推出模型在长预测跨度上必然更优的结论。</w:t>
       </w:r>
     </w:p>
     <w:p>
@@ -5148,7 +6075,7 @@
           <w:b/>
           <w:sz w:val="20"/>
         </w:rPr>
-        <w:t>表 8 不同预测跨度敏感性实验</w:t>
+        <w:t>表 9 不同预测跨度敏感性实验</w:t>
       </w:r>
     </w:p>
     <w:tbl>
@@ -5455,7 +6382,7 @@
           <w:b/>
           <w:sz w:val="22"/>
         </w:rPr>
-        <w:t>4.2.7 注意力机制可解释性分析 (Attention Interpretability)</w:t>
+        <w:t>4.2.8 注意力机制可解释性分析 (Attention Interpretability)</w:t>
       </w:r>
     </w:p>
     <w:p>
@@ -5466,7 +6393,7 @@
         <w:drawing>
           <wp:inline xmlns:a="http://schemas.openxmlformats.org/drawingml/2006/main" xmlns:pic="http://schemas.openxmlformats.org/drawingml/2006/picture">
             <wp:extent cx="5303520" cy="3977640"/>
-            <wp:docPr id="5" name="Picture 5"/>
+            <wp:docPr id="7" name="Picture 7"/>
             <wp:cNvGraphicFramePr>
               <a:graphicFrameLocks noChangeAspect="1"/>
             </wp:cNvGraphicFramePr>
@@ -5478,7 +6405,7 @@
                     <pic:cNvPicPr/>
                   </pic:nvPicPr>
                   <pic:blipFill>
-                    <a:blip r:embed="rId13"/>
+                    <a:blip r:embed="rId15"/>
                     <a:stretch>
                       <a:fillRect/>
                     </a:stretch>
@@ -5535,7 +6462,7 @@
           <w:b/>
           <w:sz w:val="22"/>
         </w:rPr>
-        <w:t>4.2.8 计算部署实时性</w:t>
+        <w:t>4.2.9 计算部署实时性</w:t>
       </w:r>
     </w:p>
     <w:p>
@@ -5562,7 +6489,7 @@
           <w:b/>
           <w:sz w:val="22"/>
         </w:rPr>
-        <w:t>4.2.9 复现性说明</w:t>
+        <w:t>4.2.10 复现性说明</w:t>
       </w:r>
     </w:p>
     <w:p>
@@ -5694,7 +6621,7 @@
           <w:b w:val="0"/>
           <w:sz w:val="24"/>
         </w:rPr>
-        <w:t>除表 7 的门控偏置和表 8 的预测跨度敏感性外，网络结构参数仍需在更完整的实验中进一步网格搜索。当前模型采用 $D=64$、4 个注意力头和 2 层编码器/解码器，主要依据训练稳定性和计算成本折中确定。</w:t>
+        <w:t>除表 8 的门控偏置和表 9 的预测跨度敏感性外，网络结构参数仍需在更完整的实验中进一步网格搜索。当前模型采用 $D=64$、4 个注意力头和 2 层编码器/解码器，主要依据训练稳定性和计算成本折中确定。</w:t>
       </w:r>
     </w:p>
     <w:p>
@@ -5734,7 +6661,7 @@
           <w:b w:val="0"/>
           <w:sz w:val="24"/>
         </w:rPr>
-        <w:t>本文针对新能源短期功率预测在设备故障、电网限电及计划检修等运维事件下容易出现误差放大的问题，提出了基于事件嵌入融合和 O&amp;M Gate 门控抑制的 Transformer 预测流程。GitHub Actions 复现实验表明，场站专属建模相较空间共享模型可降低 20.83%~64.32% 的 MAE；在场站 C 上引入运维事件后，总体 MAE 由 1.096 MW 降至 0.566 MW，运维事件时段 MAE 由 2.439 MW 降至 1.482 MW；在计划检修时段，门控模型 MAE 为 0.106 MW，较不含事件的基线显著降低，并较无门控融合模型略有改善。本文同时补充了时间切分、事件分布、事件持续时间、未来事件可获得性和远端复现实验流程，以增强实验透明度。受限于当前公开样例数据规模和外部基线尚未完全统一复现，后续研究将进一步在更长周期、多区域真实 SCADA 与工单数据上验证，并补充 LSTM、Informer、PatchTST 等模型在同一协议下的公平对比。</w:t>
+        <w:t>本文针对新能源短期功率预测在设备故障、电网限电及计划检修等运维事件下容易出现误差放大的问题，提出了基于事件嵌入融合和 O&amp;M Gate 门控抑制的 Transformer 预测流程。复现实验表明，场站专属建模相较空间共享模型可降低 20.83%~64.32% 的 MAE；在场站 C 上，本文方法总体 MAE 为 0.528 MW，优于持久性预测、Ridge、SVR、随机森林、MLP、LSTM、GRU 和普通 Transformer 等经典基线；在计划检修时段，门控模型 MAE 为 0.106 MW，较不含事件的基线显著降低，并较无门控融合模型略有改善。本文同时补充了时间切分、事件分布、事件持续时间、未来事件可获得性和远端复现实验流程，以增强实验透明度。受限于当前公开样例数据规模，后续研究将进一步在更长周期、多区域真实 SCADA 与工单数据上验证，并扩展 Informer、Autoformer、PatchTST 等前沿时序模型在同一协议下的公平对比。</w:t>
       </w:r>
     </w:p>
     <w:p>

</xml_diff>